<commit_message>
chore: commit all assets + sync codebase with live site state
- Add all 49 extra-images (banners, gallery, partner logos, Sikatrix logo) — were deployed via CLI but never committed to git
- Add public/images/ (logo.png, footer-logo.png) — same issue
- Sync all src/ changes from previous session (Fixes 3–9): colour tokens, leadership, privacy policy, /apply page, /fees page, gallery filenames, maps, navbar, cookie consent, contact form, animated stats, admissions banner
- Update DOCX: fees R1,300/month + R250 registration + Reference Number field in Office Use section
- Partners marquee: gap 14→2, logo heights 72→96 (Sikatrix 48→72), maxW increased
- Footer: replace text wordmark with footer-logo.png image
- Apply page: reference number notice made more prominent with example format

Co-Authored-By: Claude Sonnet 4.6 <noreply@anthropic.com>
</commit_message>
<xml_diff>
--- a/public/downloads/SIS-Application-Form-2027.docx
+++ b/public/downloads/SIS-Application-Form-2027.docx
@@ -114,6 +114,47 @@
         <w:gridCol w:w="3977"/>
         <w:gridCol w:w="6488"/>
       </w:tblGrid>
+      <w:tr>
+        <w:tc>
+          <w:tcPr>
+            <w:tcW w:type="dxa" w:w="3977"/>
+            <w:shading w:val="clear" w:color="auto" w:fill="E8E9F4"/>
+          </w:tcPr>
+          <w:p>
+            <w:pPr>
+              <w:spacing w:after="60" w:before="60"/>
+            </w:pPr>
+            <w:r>
+              <w:rPr>
+                <w:rFonts w:ascii="Arial" w:cs="Arial" w:hAnsi="Arial"/>
+                <w:b/>
+                <w:sz w:val="18"/>
+                <w:szCs w:val="18"/>
+              </w:rPr>
+              <w:t xml:space="preserve">Online Application Reference No.</w:t>
+            </w:r>
+          </w:p>
+        </w:tc>
+        <w:tc>
+          <w:tcPr>
+            <w:tcW w:type="dxa" w:w="6488"/>
+          </w:tcPr>
+          <w:p>
+            <w:pPr>
+              <w:spacing w:after="60" w:before="60"/>
+            </w:pPr>
+            <w:r>
+              <w:rPr>
+                <w:rFonts w:ascii="Arial" w:cs="Arial" w:hAnsi="Arial"/>
+                <w:sz w:val="18"/>
+                <w:szCs w:val="18"/>
+                <w:color w:val="888888"/>
+              </w:rPr>
+              <w:t xml:space="preserve">SIS-2027-______  (from online enquiry confirmation email)</w:t>
+            </w:r>
+          </w:p>
+        </w:tc>
+      </w:tr>
       <w:tr>
         <w:tc>
           <w:tcPr>
@@ -1200,6 +1241,47 @@
         <w:tc>
           <w:tcPr>
             <w:tcW w:type="dxa" w:w="3977"/>
+            <w:shading w:val="clear" w:color="auto" w:fill="E8E9F4"/>
+          </w:tcPr>
+          <w:p>
+            <w:pPr>
+              <w:spacing w:after="60" w:before="60"/>
+            </w:pPr>
+            <w:r>
+              <w:rPr>
+                <w:rFonts w:ascii="Arial" w:cs="Arial" w:hAnsi="Arial"/>
+                <w:b/>
+                <w:sz w:val="18"/>
+                <w:szCs w:val="18"/>
+              </w:rPr>
+              <w:t xml:space="preserve">Online Application Reference No.</w:t>
+            </w:r>
+          </w:p>
+        </w:tc>
+        <w:tc>
+          <w:tcPr>
+            <w:tcW w:type="dxa" w:w="6488"/>
+          </w:tcPr>
+          <w:p>
+            <w:pPr>
+              <w:spacing w:after="60" w:before="60"/>
+            </w:pPr>
+            <w:r>
+              <w:rPr>
+                <w:rFonts w:ascii="Arial" w:cs="Arial" w:hAnsi="Arial"/>
+                <w:sz w:val="18"/>
+                <w:szCs w:val="18"/>
+                <w:color w:val="888888"/>
+              </w:rPr>
+              <w:t xml:space="preserve">SIS-2027-______  (from online enquiry confirmation email)</w:t>
+            </w:r>
+          </w:p>
+        </w:tc>
+      </w:tr>
+      <w:tr>
+        <w:tc>
+          <w:tcPr>
+            <w:tcW w:type="dxa" w:w="3977"/>
             <w:tcBorders>
               <w:top w:val="single" w:color="C5C8E8" w:sz="1"/>
               <w:left w:val="single" w:color="C5C8E8" w:sz="1"/>
@@ -1811,6 +1893,47 @@
         <w:tc>
           <w:tcPr>
             <w:tcW w:type="dxa" w:w="3977"/>
+            <w:shading w:val="clear" w:color="auto" w:fill="E8E9F4"/>
+          </w:tcPr>
+          <w:p>
+            <w:pPr>
+              <w:spacing w:after="60" w:before="60"/>
+            </w:pPr>
+            <w:r>
+              <w:rPr>
+                <w:rFonts w:ascii="Arial" w:cs="Arial" w:hAnsi="Arial"/>
+                <w:b/>
+                <w:sz w:val="18"/>
+                <w:szCs w:val="18"/>
+              </w:rPr>
+              <w:t xml:space="preserve">Online Application Reference No.</w:t>
+            </w:r>
+          </w:p>
+        </w:tc>
+        <w:tc>
+          <w:tcPr>
+            <w:tcW w:type="dxa" w:w="6488"/>
+          </w:tcPr>
+          <w:p>
+            <w:pPr>
+              <w:spacing w:after="60" w:before="60"/>
+            </w:pPr>
+            <w:r>
+              <w:rPr>
+                <w:rFonts w:ascii="Arial" w:cs="Arial" w:hAnsi="Arial"/>
+                <w:sz w:val="18"/>
+                <w:szCs w:val="18"/>
+                <w:color w:val="888888"/>
+              </w:rPr>
+              <w:t xml:space="preserve">SIS-2027-______  (from online enquiry confirmation email)</w:t>
+            </w:r>
+          </w:p>
+        </w:tc>
+      </w:tr>
+      <w:tr>
+        <w:tc>
+          <w:tcPr>
+            <w:tcW w:type="dxa" w:w="3977"/>
             <w:tcBorders>
               <w:top w:val="single" w:color="C5C8E8" w:sz="1"/>
               <w:left w:val="single" w:color="C5C8E8" w:sz="1"/>
@@ -2418,6 +2541,47 @@
         <w:gridCol w:w="3977"/>
         <w:gridCol w:w="6488"/>
       </w:tblGrid>
+      <w:tr>
+        <w:tc>
+          <w:tcPr>
+            <w:tcW w:type="dxa" w:w="3977"/>
+            <w:shading w:val="clear" w:color="auto" w:fill="E8E9F4"/>
+          </w:tcPr>
+          <w:p>
+            <w:pPr>
+              <w:spacing w:after="60" w:before="60"/>
+            </w:pPr>
+            <w:r>
+              <w:rPr>
+                <w:rFonts w:ascii="Arial" w:cs="Arial" w:hAnsi="Arial"/>
+                <w:b/>
+                <w:sz w:val="18"/>
+                <w:szCs w:val="18"/>
+              </w:rPr>
+              <w:t xml:space="preserve">Online Application Reference No.</w:t>
+            </w:r>
+          </w:p>
+        </w:tc>
+        <w:tc>
+          <w:tcPr>
+            <w:tcW w:type="dxa" w:w="6488"/>
+          </w:tcPr>
+          <w:p>
+            <w:pPr>
+              <w:spacing w:after="60" w:before="60"/>
+            </w:pPr>
+            <w:r>
+              <w:rPr>
+                <w:rFonts w:ascii="Arial" w:cs="Arial" w:hAnsi="Arial"/>
+                <w:sz w:val="18"/>
+                <w:szCs w:val="18"/>
+                <w:color w:val="888888"/>
+              </w:rPr>
+              <w:t xml:space="preserve">SIS-2027-______  (from online enquiry confirmation email)</w:t>
+            </w:r>
+          </w:p>
+        </w:tc>
+      </w:tr>
       <w:tr>
         <w:tc>
           <w:tcPr>
@@ -2906,6 +3070,47 @@
         <w:tc>
           <w:tcPr>
             <w:tcW w:type="dxa" w:w="3977"/>
+            <w:shading w:val="clear" w:color="auto" w:fill="E8E9F4"/>
+          </w:tcPr>
+          <w:p>
+            <w:pPr>
+              <w:spacing w:after="60" w:before="60"/>
+            </w:pPr>
+            <w:r>
+              <w:rPr>
+                <w:rFonts w:ascii="Arial" w:cs="Arial" w:hAnsi="Arial"/>
+                <w:b/>
+                <w:sz w:val="18"/>
+                <w:szCs w:val="18"/>
+              </w:rPr>
+              <w:t xml:space="preserve">Online Application Reference No.</w:t>
+            </w:r>
+          </w:p>
+        </w:tc>
+        <w:tc>
+          <w:tcPr>
+            <w:tcW w:type="dxa" w:w="6488"/>
+          </w:tcPr>
+          <w:p>
+            <w:pPr>
+              <w:spacing w:after="60" w:before="60"/>
+            </w:pPr>
+            <w:r>
+              <w:rPr>
+                <w:rFonts w:ascii="Arial" w:cs="Arial" w:hAnsi="Arial"/>
+                <w:sz w:val="18"/>
+                <w:szCs w:val="18"/>
+                <w:color w:val="888888"/>
+              </w:rPr>
+              <w:t xml:space="preserve">SIS-2027-______  (from online enquiry confirmation email)</w:t>
+            </w:r>
+          </w:p>
+        </w:tc>
+      </w:tr>
+      <w:tr>
+        <w:tc>
+          <w:tcPr>
+            <w:tcW w:type="dxa" w:w="3977"/>
             <w:tcBorders>
               <w:top w:val="single" w:color="C5C8E8" w:sz="1"/>
               <w:left w:val="single" w:color="C5C8E8" w:sz="1"/>
@@ -3392,6 +3597,47 @@
         <w:tc>
           <w:tcPr>
             <w:tcW w:type="dxa" w:w="3977"/>
+            <w:shading w:val="clear" w:color="auto" w:fill="E8E9F4"/>
+          </w:tcPr>
+          <w:p>
+            <w:pPr>
+              <w:spacing w:after="60" w:before="60"/>
+            </w:pPr>
+            <w:r>
+              <w:rPr>
+                <w:rFonts w:ascii="Arial" w:cs="Arial" w:hAnsi="Arial"/>
+                <w:b/>
+                <w:sz w:val="18"/>
+                <w:szCs w:val="18"/>
+              </w:rPr>
+              <w:t xml:space="preserve">Online Application Reference No.</w:t>
+            </w:r>
+          </w:p>
+        </w:tc>
+        <w:tc>
+          <w:tcPr>
+            <w:tcW w:type="dxa" w:w="6488"/>
+          </w:tcPr>
+          <w:p>
+            <w:pPr>
+              <w:spacing w:after="60" w:before="60"/>
+            </w:pPr>
+            <w:r>
+              <w:rPr>
+                <w:rFonts w:ascii="Arial" w:cs="Arial" w:hAnsi="Arial"/>
+                <w:sz w:val="18"/>
+                <w:szCs w:val="18"/>
+                <w:color w:val="888888"/>
+              </w:rPr>
+              <w:t xml:space="preserve">SIS-2027-______  (from online enquiry confirmation email)</w:t>
+            </w:r>
+          </w:p>
+        </w:tc>
+      </w:tr>
+      <w:tr>
+        <w:tc>
+          <w:tcPr>
+            <w:tcW w:type="dxa" w:w="3977"/>
             <w:tcBorders>
               <w:top w:val="single" w:color="C5C8E8" w:sz="1"/>
               <w:left w:val="single" w:color="C5C8E8" w:sz="1"/>
@@ -3732,6 +3978,47 @@
         <w:gridCol w:w="3977"/>
         <w:gridCol w:w="6488"/>
       </w:tblGrid>
+      <w:tr>
+        <w:tc>
+          <w:tcPr>
+            <w:tcW w:type="dxa" w:w="3977"/>
+            <w:shading w:val="clear" w:color="auto" w:fill="E8E9F4"/>
+          </w:tcPr>
+          <w:p>
+            <w:pPr>
+              <w:spacing w:after="60" w:before="60"/>
+            </w:pPr>
+            <w:r>
+              <w:rPr>
+                <w:rFonts w:ascii="Arial" w:cs="Arial" w:hAnsi="Arial"/>
+                <w:b/>
+                <w:sz w:val="18"/>
+                <w:szCs w:val="18"/>
+              </w:rPr>
+              <w:t xml:space="preserve">Online Application Reference No.</w:t>
+            </w:r>
+          </w:p>
+        </w:tc>
+        <w:tc>
+          <w:tcPr>
+            <w:tcW w:type="dxa" w:w="6488"/>
+          </w:tcPr>
+          <w:p>
+            <w:pPr>
+              <w:spacing w:after="60" w:before="60"/>
+            </w:pPr>
+            <w:r>
+              <w:rPr>
+                <w:rFonts w:ascii="Arial" w:cs="Arial" w:hAnsi="Arial"/>
+                <w:sz w:val="18"/>
+                <w:szCs w:val="18"/>
+                <w:color w:val="888888"/>
+              </w:rPr>
+              <w:t xml:space="preserve">SIS-2027-______  (from online enquiry confirmation email)</w:t>
+            </w:r>
+          </w:p>
+        </w:tc>
+      </w:tr>
       <w:tr>
         <w:tc>
           <w:tcPr>
@@ -4872,7 +5159,7 @@
                 <w:sz w:val="20"/>
                 <w:szCs w:val="20"/>
               </w:rPr>
-              <w:t xml:space="preserve">11-month option: R1,200/month   |   12-month option: R1,100/month</w:t>
+              <w:t xml:space="preserve">School fees: R1,300/month</w:t>
             </w:r>
           </w:p>
           <w:p>
@@ -4889,7 +5176,7 @@
                 <w:sz w:val="19"/>
                 <w:szCs w:val="19"/>
               </w:rPr>
-              <w:t xml:space="preserve">Registration fee (non-refundable): R210</w:t>
+              <w:t xml:space="preserve">Registration fee (non-refundable): R250</w:t>
             </w:r>
           </w:p>
         </w:tc>
@@ -5083,7 +5370,7 @@
           <w:sz w:val="19"/>
           <w:szCs w:val="19"/>
         </w:rPr>
-        <w:t xml:space="preserve">☐  Registration fee proof of payment: R210 non-refundable</w:t>
+        <w:t xml:space="preserve">☐  Registration fee proof of payment: R250 non-refundable</w:t>
       </w:r>
     </w:p>
     <w:p>
@@ -5621,6 +5908,47 @@
         <w:gridCol w:w="3977"/>
         <w:gridCol w:w="6488"/>
       </w:tblGrid>
+      <w:tr>
+        <w:tc>
+          <w:tcPr>
+            <w:tcW w:type="dxa" w:w="3977"/>
+            <w:shading w:val="clear" w:color="auto" w:fill="E8E9F4"/>
+          </w:tcPr>
+          <w:p>
+            <w:pPr>
+              <w:spacing w:after="60" w:before="60"/>
+            </w:pPr>
+            <w:r>
+              <w:rPr>
+                <w:rFonts w:ascii="Arial" w:cs="Arial" w:hAnsi="Arial"/>
+                <w:b/>
+                <w:sz w:val="18"/>
+                <w:szCs w:val="18"/>
+              </w:rPr>
+              <w:t xml:space="preserve">Online Application Reference No.</w:t>
+            </w:r>
+          </w:p>
+        </w:tc>
+        <w:tc>
+          <w:tcPr>
+            <w:tcW w:type="dxa" w:w="6488"/>
+          </w:tcPr>
+          <w:p>
+            <w:pPr>
+              <w:spacing w:after="60" w:before="60"/>
+            </w:pPr>
+            <w:r>
+              <w:rPr>
+                <w:rFonts w:ascii="Arial" w:cs="Arial" w:hAnsi="Arial"/>
+                <w:sz w:val="18"/>
+                <w:szCs w:val="18"/>
+                <w:color w:val="888888"/>
+              </w:rPr>
+              <w:t xml:space="preserve">SIS-2027-______  (from online enquiry confirmation email)</w:t>
+            </w:r>
+          </w:p>
+        </w:tc>
+      </w:tr>
       <w:tr>
         <w:tc>
           <w:tcPr>

</xml_diff>